<commit_message>
Rédaction : sections 4 (gouvernance dualiste) et 5 (acteurs, délégation), format Word
Co-Authored-By: Claude Opus 5.5 <noreply@anthropic.com>
Claude-Session: https://claude.ai/code/session_01BMtPhiCmF4fJJwSAqbwbtJ
</commit_message>
<xml_diff>
--- a/Redaction/Partie_1_Introduction_S1-S3.docx
+++ b/Redaction/Partie_1_Introduction_S1-S3.docx
@@ -131,8 +131,8 @@
     <w:p>
       <w:pPr>
         <w:sectPr>
-          <w:headerReference w:type="default" r:id="rId11"/>
-          <w:footerReference w:type="default" r:id="rId12"/>
+          <w:headerReference w:type="default" r:id="rId9"/>
+          <w:footerReference w:type="default" r:id="rId10"/>
           <w:pgSz w:w="11906" w:h="16838"/>
           <w:pgMar w:top="1417" w:right="1417" w:bottom="1417" w:left="1417" w:header="720" w:footer="720" w:gutter="0"/>
           <w:cols w:space="720"/>
@@ -153,23 +153,30 @@
     <w:p>
       <w:r>
         <w:fldChar w:fldCharType="begin"/>
-        <w:instrText xml:space="preserve">TOC \o "1-3" \h \z \u</w:instrText>
+        <w:instrText xml:space="preserve">TOC \o "1-2" \h \z \u</w:instrText>
         <w:fldChar w:fldCharType="separate"/>
         <w:fldChar w:fldCharType="end"/>
       </w:r>
     </w:p>
     <w:p>
       <w:r>
-        <w:rPr>
-          <w:i/>
-          <w:sz w:val="18"/>
-        </w:rPr>
-        <w:t>(Clic droit sur la table puis « Mettre à jour les champs » pour l'afficher dans Word.)</w:t>
+        <w:br w:type="page"/>
+      </w:r>
+    </w:p>
+    <w:p>
+      <w:pPr>
+        <w:pStyle w:val="Heading1"/>
+      </w:pPr>
+      <w:r>
+        <w:t>La Centrale téléphonique des médecins de garde (CTMG) – Unisanté</w:t>
       </w:r>
     </w:p>
     <w:p>
       <w:r>
-        <w:br w:type="page"/>
+        <w:rPr>
+          <w:i/>
+        </w:rPr>
+        <w:t>Module Orchestration stratégique RH – Dr Joëlle Bédat – CAS Stratégie et organisation, MRHC 2026</w:t>
       </w:r>
     </w:p>
     <w:p>
@@ -232,7 +239,7 @@
     </w:p>
     <w:p>
       <w:pPr>
-        <w:pStyle w:val="Heading3"/>
+        <w:pStyle w:val="Heading2"/>
       </w:pPr>
       <w:r>
         <w:t>1.1 Mission et statut</w:t>
@@ -240,17 +247,17 @@
     </w:p>
     <w:p>
       <w:r>
-        <w:t>La CTMG est une ligne téléphonique publique, financée par le contribuable, au service de la population des cantons de Vaud et de Neuchâtel, qui la mandatent. Elle constitue l'un des éléments du dispositif d'urgence et de santé communautaire de ces deux cantons (Unisanté, s.d.). Elle reçoit les demandes d'aide médicale et de détresse psychologique qui ne relèvent pas de l'urgence vitale. Les situations sont évaluées puis orientées vers la ressource la plus adaptée : médecin de garde, service d'urgence, centrale 144, médecin traitant ou simple conseil. La CTMG est aussi l'interlocutrice de nombreux partenaires sanitaires et sociaux : centrale 144, médecins de garde, hôpitaux, centres médico-sociaux, établissements médico-sociaux, police.</w:t>
+        <w:t>La CTMG est une ligne téléphonique publique, financée par le contribuable, au service de la population des cantons de Vaud et de Neuchâtel, qui la mandatent. Elle constitue l'un des éléments du dispositif d'urgence et de santé communautaire de ces deux cantons (Unisanté, s.d.-c). Elle reçoit les demandes d'aide médicale et de détresse psychologique qui ne relèvent pas de l'urgence vitale. Les situations sont évaluées puis orientées vers la ressource la plus adaptée : médecin de garde, service d'urgence, centrale 144, médecin traitant ou simple conseil. La CTMG est aussi l'interlocutrice de nombreux partenaires sanitaires et sociaux : centrale 144, médecins de garde, hôpitaux, centres médico-sociaux, établissements médico-sociaux, police.</w:t>
       </w:r>
     </w:p>
     <w:p>
       <w:r>
-        <w:t>Depuis le 1er juillet 2024, la CTMG est un secteur du Département urgences et santé communautaires (DUSC) d'Unisanté (Unisanté, s.d.). Unisanté est un établissement autonome de droit public vaudois, doté d'une personnalité juridique propre, placé sous la surveillance du Département de la santé et de l'action sociale (DSAS) et de l'Université de Lausanne (Unisanté, 2022). La CTMG relève donc pleinement de la sphère publique, et cela conditionne sa gouvernance comme sa gestion des ressources humaines (voir section 3).</w:t>
+        <w:t>Depuis le 1er juillet 2024, la CTMG est un secteur du Département urgences et santé communautaires (DUSC) d'Unisanté (Unisanté, s.d.-c). Unisanté est un établissement autonome de droit public vaudois, doté d'une personnalité juridique propre, placé sous la surveillance du Département de la santé et de l'action sociale (DSAS) et de l'Université de Lausanne (Unisanté, 2022). La CTMG relève donc pleinement de la sphère publique, et cela conditionne sa gouvernance comme sa gestion des ressources humaines (voir section 3).</w:t>
       </w:r>
     </w:p>
     <w:p>
       <w:pPr>
-        <w:pStyle w:val="Heading3"/>
+        <w:pStyle w:val="Heading2"/>
       </w:pPr>
       <w:r>
         <w:t>1.2 Une trajectoire institutionnelle récente et agitée</w:t>
@@ -258,7 +265,7 @@
     </w:p>
     <w:p>
       <w:r>
-        <w:t>La situation actuelle ne se comprend pas sans son histoire proche. Jusqu'en 2024, la CTMG était gérée, comme la centrale 144, par la Fondation Urgences Santé. Après des travaux engagés à l'été 2022 sous l'égide du DSAS, le Conseil d'État vaudois a décidé de rattacher les deux centrales à deux entités distinctes : le 144 au CHUV, la CTMG à Unisanté. Ce choix a conduit à la dissolution de fait de la Fondation (CHUV, s.d. ; État de Vaud, s.d.). Pendant cette transition, conduite entre 2022 et 2024, la centrale a été placée sous la tutelle de l'État-major cantonal de conduite (EMCC), selon les collaborateurs (E1). À l'interne, le poste de cheffe de service a été créé et pourvu en septembre 2022. Les trois cadres de proximité de l'époque ont démissionné successivement et ont été remplacés.</w:t>
+        <w:t>La situation actuelle ne se comprend pas sans son histoire proche. Jusqu'en 2024, la CTMG était gérée, comme la centrale 144, par la Fondation Urgences Santé. Après des travaux engagés à l'été 2022 sous l'égide du DSAS, le Conseil d'État vaudois a décidé de rattacher les deux centrales à deux entités distinctes : le 144 au CHUV, la CTMG à Unisanté. Ce choix a conduit à la dissolution de fait de la Fondation (CHUV, s.d. ; État de Vaud, s.d.-a). Pendant cette transition, conduite entre 2022 et 2024, la centrale a été placée sous la tutelle de l'État-major cantonal de conduite (EMCC), selon les collaborateurs (E1). À l'interne, le poste de cheffe de service a été créé et pourvu en septembre 2022. Les trois cadres de proximité de l'époque ont démissionné successivement et ont été remplacés.</w:t>
       </w:r>
     </w:p>
     <w:p>
@@ -268,7 +275,7 @@
     </w:p>
     <w:p>
       <w:pPr>
-        <w:pStyle w:val="Heading3"/>
+        <w:pStyle w:val="Heading2"/>
       </w:pPr>
       <w:r>
         <w:t>1.3 Organisation interne</w:t>
@@ -286,7 +293,7 @@
     </w:p>
     <w:p>
       <w:pPr>
-        <w:pStyle w:val="Heading3"/>
+        <w:pStyle w:val="Heading2"/>
       </w:pPr>
       <w:r>
         <w:t>1.4 Enjeux stratégiques</w:t>
@@ -362,7 +369,7 @@
     </w:p>
     <w:p>
       <w:pPr>
-        <w:pStyle w:val="Heading3"/>
+        <w:pStyle w:val="Heading2"/>
       </w:pPr>
       <w:r>
         <w:t>3.1 Une configuration d'administration publique hybride</w:t>
@@ -419,7 +426,7 @@
     </w:p>
     <w:p>
       <w:pPr>
-        <w:pStyle w:val="Heading3"/>
+        <w:pStyle w:val="Heading2"/>
       </w:pPr>
       <w:r>
         <w:t>3.2 Une trajectoire de transition encore active</w:t>
@@ -458,7 +465,6 @@
     </w:p>
     <w:p>
       <w:pPr>
-        <w:spacing w:line="276" w:lineRule="auto"/>
         <w:ind w:left="709" w:hanging="709"/>
         <w:jc w:val="left"/>
       </w:pPr>
@@ -477,7 +483,6 @@
     </w:p>
     <w:p>
       <w:pPr>
-        <w:spacing w:line="276" w:lineRule="auto"/>
         <w:ind w:left="709" w:hanging="709"/>
         <w:jc w:val="left"/>
       </w:pPr>
@@ -496,7 +501,6 @@
     </w:p>
     <w:p>
       <w:pPr>
-        <w:spacing w:line="276" w:lineRule="auto"/>
         <w:ind w:left="709" w:hanging="709"/>
         <w:jc w:val="left"/>
       </w:pPr>
@@ -515,7 +519,6 @@
     </w:p>
     <w:p>
       <w:pPr>
-        <w:spacing w:line="276" w:lineRule="auto"/>
         <w:ind w:left="709" w:hanging="709"/>
         <w:jc w:val="left"/>
       </w:pPr>
@@ -534,7 +537,6 @@
     </w:p>
     <w:p>
       <w:pPr>
-        <w:spacing w:line="276" w:lineRule="auto"/>
         <w:ind w:left="709" w:hanging="709"/>
         <w:jc w:val="left"/>
       </w:pPr>
@@ -553,7 +555,6 @@
     </w:p>
     <w:p>
       <w:pPr>
-        <w:spacing w:line="276" w:lineRule="auto"/>
         <w:ind w:left="709" w:hanging="709"/>
         <w:jc w:val="left"/>
       </w:pPr>
@@ -572,7 +573,6 @@
     </w:p>
     <w:p>
       <w:pPr>
-        <w:spacing w:line="276" w:lineRule="auto"/>
         <w:ind w:left="709" w:hanging="709"/>
         <w:jc w:val="left"/>
       </w:pPr>
@@ -591,7 +591,6 @@
     </w:p>
     <w:p>
       <w:pPr>
-        <w:spacing w:line="276" w:lineRule="auto"/>
         <w:ind w:left="709" w:hanging="709"/>
         <w:jc w:val="left"/>
       </w:pPr>
@@ -610,7 +609,6 @@
     </w:p>
     <w:p>
       <w:pPr>
-        <w:spacing w:line="276" w:lineRule="auto"/>
         <w:ind w:left="709" w:hanging="709"/>
         <w:jc w:val="left"/>
       </w:pPr>
@@ -629,7 +627,6 @@
     </w:p>
     <w:p>
       <w:pPr>
-        <w:spacing w:line="276" w:lineRule="auto"/>
         <w:ind w:left="709" w:hanging="709"/>
         <w:jc w:val="left"/>
       </w:pPr>
@@ -648,7 +645,6 @@
     </w:p>
     <w:p>
       <w:pPr>
-        <w:spacing w:line="276" w:lineRule="auto"/>
         <w:ind w:left="709" w:hanging="709"/>
         <w:jc w:val="left"/>
       </w:pPr>
@@ -667,7 +663,6 @@
     </w:p>
     <w:p>
       <w:pPr>
-        <w:spacing w:line="276" w:lineRule="auto"/>
         <w:ind w:left="709" w:hanging="709"/>
         <w:jc w:val="left"/>
       </w:pPr>
@@ -686,7 +681,6 @@
     </w:p>
     <w:p>
       <w:pPr>
-        <w:spacing w:line="276" w:lineRule="auto"/>
         <w:ind w:left="709" w:hanging="709"/>
         <w:jc w:val="left"/>
       </w:pPr>
@@ -705,7 +699,6 @@
     </w:p>
     <w:p>
       <w:pPr>
-        <w:spacing w:line="276" w:lineRule="auto"/>
         <w:ind w:left="709" w:hanging="709"/>
         <w:jc w:val="left"/>
       </w:pPr>
@@ -724,7 +717,6 @@
     </w:p>
     <w:p>
       <w:pPr>
-        <w:spacing w:line="276" w:lineRule="auto"/>
         <w:ind w:left="709" w:hanging="709"/>
         <w:jc w:val="left"/>
       </w:pPr>
@@ -743,7 +735,6 @@
     </w:p>
     <w:p>
       <w:pPr>
-        <w:spacing w:line="276" w:lineRule="auto"/>
         <w:ind w:left="709" w:hanging="709"/>
         <w:jc w:val="left"/>
       </w:pPr>
@@ -770,7 +761,6 @@
     </w:p>
     <w:p>
       <w:pPr>
-        <w:spacing w:line="276" w:lineRule="auto"/>
         <w:ind w:left="709" w:hanging="709"/>
         <w:jc w:val="left"/>
       </w:pPr>
@@ -789,7 +779,6 @@
     </w:p>
     <w:p>
       <w:pPr>
-        <w:spacing w:line="276" w:lineRule="auto"/>
         <w:ind w:left="709" w:hanging="709"/>
         <w:jc w:val="left"/>
       </w:pPr>
@@ -808,12 +797,11 @@
     </w:p>
     <w:p>
       <w:pPr>
-        <w:spacing w:line="276" w:lineRule="auto"/>
         <w:ind w:left="709" w:hanging="709"/>
         <w:jc w:val="left"/>
       </w:pPr>
       <w:r>
-        <w:t xml:space="preserve">État de Vaud. (s.d.). </w:t>
+        <w:t xml:space="preserve">État de Vaud. (s.d.-a). </w:t>
       </w:r>
       <w:r>
         <w:rPr>
@@ -827,7 +815,6 @@
     </w:p>
     <w:p>
       <w:pPr>
-        <w:spacing w:line="276" w:lineRule="auto"/>
         <w:ind w:left="709" w:hanging="709"/>
         <w:jc w:val="left"/>
       </w:pPr>
@@ -846,12 +833,11 @@
     </w:p>
     <w:p>
       <w:pPr>
-        <w:spacing w:line="276" w:lineRule="auto"/>
         <w:ind w:left="709" w:hanging="709"/>
         <w:jc w:val="left"/>
       </w:pPr>
       <w:r>
-        <w:t xml:space="preserve">Unisanté. (s.d.). </w:t>
+        <w:t xml:space="preserve">Unisanté. (s.d.-c). </w:t>
       </w:r>
       <w:r>
         <w:rPr>
@@ -864,8 +850,8 @@
       </w:r>
     </w:p>
     <w:sectPr>
-      <w:headerReference w:type="default" r:id="rId9"/>
-      <w:footerReference w:type="default" r:id="rId10"/>
+      <w:headerReference w:type="default" r:id="rId11"/>
+      <w:footerReference w:type="default" r:id="rId12"/>
       <w:pgSz w:w="11906" w:h="16838"/>
       <w:pgMar w:top="1417" w:right="1417" w:bottom="1417" w:left="1417" w:header="720" w:footer="720" w:gutter="0"/>
       <w:cols w:space="720"/>
@@ -880,6 +866,16 @@
   <w:p>
     <w:pPr>
       <w:pStyle w:val="Footer"/>
+    </w:pPr>
+  </w:p>
+</w:ftr>
+</file>
+
+<file path=word/footer2.xml><?xml version="1.0" encoding="utf-8"?>
+<w:ftr xmlns:m="http://schemas.openxmlformats.org/officeDocument/2006/math" xmlns:mc="http://schemas.openxmlformats.org/markup-compatibility/2006" xmlns:mo="http://schemas.microsoft.com/office/mac/office/2008/main" xmlns:mv="urn:schemas-microsoft-com:mac:vml" xmlns:o="urn:schemas-microsoft-com:office:office" xmlns:r="http://schemas.openxmlformats.org/officeDocument/2006/relationships" xmlns:v="urn:schemas-microsoft-com:vml" xmlns:w10="urn:schemas-microsoft-com:office:word" xmlns:w14="http://schemas.microsoft.com/office/word/2010/wordml" xmlns:w="http://schemas.openxmlformats.org/wordprocessingml/2006/main" xmlns:wne="http://schemas.microsoft.com/office/word/2006/wordml" xmlns:wp14="http://schemas.microsoft.com/office/word/2010/wordprocessingDrawing" xmlns:wp="http://schemas.openxmlformats.org/drawingml/2006/wordprocessingDrawing" xmlns:wpc="http://schemas.microsoft.com/office/word/2010/wordprocessingCanvas" xmlns:wpg="http://schemas.microsoft.com/office/word/2010/wordprocessingGroup" xmlns:wpi="http://schemas.microsoft.com/office/word/2010/wordprocessingInk" xmlns:wps="http://schemas.microsoft.com/office/word/2010/wordprocessingShape" mc:Ignorable="w14 wp14">
+  <w:p>
+    <w:pPr>
+      <w:pStyle w:val="Footer"/>
       <w:jc w:val="center"/>
     </w:pPr>
     <w:r>
@@ -895,30 +891,12 @@
 </w:ftr>
 </file>
 
-<file path=word/footer2.xml><?xml version="1.0" encoding="utf-8"?>
-<w:ftr xmlns:m="http://schemas.openxmlformats.org/officeDocument/2006/math" xmlns:mc="http://schemas.openxmlformats.org/markup-compatibility/2006" xmlns:mo="http://schemas.microsoft.com/office/mac/office/2008/main" xmlns:mv="urn:schemas-microsoft-com:mac:vml" xmlns:o="urn:schemas-microsoft-com:office:office" xmlns:r="http://schemas.openxmlformats.org/officeDocument/2006/relationships" xmlns:v="urn:schemas-microsoft-com:vml" xmlns:w10="urn:schemas-microsoft-com:office:word" xmlns:w14="http://schemas.microsoft.com/office/word/2010/wordml" xmlns:w="http://schemas.openxmlformats.org/wordprocessingml/2006/main" xmlns:wne="http://schemas.microsoft.com/office/word/2006/wordml" xmlns:wp14="http://schemas.microsoft.com/office/word/2010/wordprocessingDrawing" xmlns:wp="http://schemas.openxmlformats.org/drawingml/2006/wordprocessingDrawing" xmlns:wpc="http://schemas.microsoft.com/office/word/2010/wordprocessingCanvas" xmlns:wpg="http://schemas.microsoft.com/office/word/2010/wordprocessingGroup" xmlns:wpi="http://schemas.microsoft.com/office/word/2010/wordprocessingInk" xmlns:wps="http://schemas.microsoft.com/office/word/2010/wordprocessingShape" mc:Ignorable="w14 wp14">
-  <w:p>
-    <w:pPr>
-      <w:pStyle w:val="Footer"/>
-    </w:pPr>
-  </w:p>
-</w:ftr>
-</file>
-
 <file path=word/header1.xml><?xml version="1.0" encoding="utf-8"?>
 <w:hdr xmlns:m="http://schemas.openxmlformats.org/officeDocument/2006/math" xmlns:mc="http://schemas.openxmlformats.org/markup-compatibility/2006" xmlns:mo="http://schemas.microsoft.com/office/mac/office/2008/main" xmlns:mv="urn:schemas-microsoft-com:mac:vml" xmlns:o="urn:schemas-microsoft-com:office:office" xmlns:r="http://schemas.openxmlformats.org/officeDocument/2006/relationships" xmlns:v="urn:schemas-microsoft-com:vml" xmlns:w10="urn:schemas-microsoft-com:office:word" xmlns:w14="http://schemas.microsoft.com/office/word/2010/wordml" xmlns:w="http://schemas.openxmlformats.org/wordprocessingml/2006/main" xmlns:wne="http://schemas.microsoft.com/office/word/2006/wordml" xmlns:wp14="http://schemas.microsoft.com/office/word/2010/wordprocessingDrawing" xmlns:wp="http://schemas.openxmlformats.org/drawingml/2006/wordprocessingDrawing" xmlns:wpc="http://schemas.microsoft.com/office/word/2010/wordprocessingCanvas" xmlns:wpg="http://schemas.microsoft.com/office/word/2010/wordprocessingGroup" xmlns:wpi="http://schemas.microsoft.com/office/word/2010/wordprocessingInk" xmlns:wps="http://schemas.microsoft.com/office/word/2010/wordprocessingShape" mc:Ignorable="w14 wp14">
   <w:p>
     <w:pPr>
       <w:pStyle w:val="Header"/>
-      <w:jc w:val="right"/>
-    </w:pPr>
-    <w:r>
-      <w:rPr>
-        <w:i/>
-        <w:sz w:val="18"/>
-      </w:rPr>
-      <w:t>Orchestration stratégique RH – Zargui-Naji</w:t>
-    </w:r>
+    </w:pPr>
   </w:p>
 </w:hdr>
 </file>
@@ -928,7 +906,15 @@
   <w:p>
     <w:pPr>
       <w:pStyle w:val="Header"/>
-    </w:pPr>
+      <w:jc w:val="right"/>
+    </w:pPr>
+    <w:r>
+      <w:rPr>
+        <w:i/>
+        <w:sz w:val="18"/>
+      </w:rPr>
+      <w:t>Orchestration stratégique RH – Zargui-Naji</w:t>
+    </w:r>
   </w:p>
 </w:hdr>
 </file>
@@ -1396,7 +1382,7 @@
       <w:bCs/>
       <w:i w:val="0"/>
       <w:color w:val="1F3A5F"/>
-      <w:sz w:val="26"/>
+      <w:sz w:val="25"/>
       <w:szCs w:val="26"/>
     </w:rPr>
   </w:style>

</xml_diff>